<commit_message>
cv: BSc obtained (9.35) + QuickOrg2 live on Google Play (RO/EN docx+png)
Co-Authored-By: Claude Opus 4.8 <noreply@anthropic.com>
</commit_message>
<xml_diff>
--- a/Images/cv-en.docx
+++ b/Images/cv-en.docx
@@ -124,15 +124,7 @@
                 <w:sz w:val="20"/>
                 <w:szCs w:val="20"/>
               </w:rPr>
-              <w:t xml:space="preserve">Phone: </w:t>
-            </w:r>
-            <w:r>
-              <w:rPr>
-                <w:color w:val="FFFFFF"/>
-                <w:sz w:val="20"/>
-                <w:szCs w:val="20"/>
-              </w:rPr>
-              <w:t xml:space="preserve">  0750 443 012</w:t>
+              <w:t xml:space="preserve">Phone:   0750 443 012</w:t>
             </w:r>
           </w:p>
           <w:p>
@@ -145,15 +137,7 @@
                 <w:sz w:val="20"/>
                 <w:szCs w:val="20"/>
               </w:rPr>
-              <w:t xml:space="preserve">Email: </w:t>
-            </w:r>
-            <w:r>
-              <w:rPr>
-                <w:color w:val="FFFFFF"/>
-                <w:sz w:val="20"/>
-                <w:szCs w:val="20"/>
-              </w:rPr>
-              <w:t xml:space="preserve">  frunzaandy16@gmail.com</w:t>
+              <w:t xml:space="preserve">Email:   frunzaandy16@gmail.com</w:t>
             </w:r>
           </w:p>
           <w:p>
@@ -166,15 +150,7 @@
                 <w:sz w:val="20"/>
                 <w:szCs w:val="20"/>
               </w:rPr>
-              <w:t xml:space="preserve">Born: </w:t>
-            </w:r>
-            <w:r>
-              <w:rPr>
-                <w:color w:val="FFFFFF"/>
-                <w:sz w:val="20"/>
-                <w:szCs w:val="20"/>
-              </w:rPr>
-              <w:t xml:space="preserve">  14.12.2000</w:t>
+              <w:t xml:space="preserve">Born:   14.12.2000</w:t>
             </w:r>
           </w:p>
           <w:p>
@@ -187,15 +163,7 @@
                 <w:sz w:val="20"/>
                 <w:szCs w:val="20"/>
               </w:rPr>
-              <w:t xml:space="preserve">Nationality: </w:t>
-            </w:r>
-            <w:r>
-              <w:rPr>
-                <w:color w:val="FFFFFF"/>
-                <w:sz w:val="20"/>
-                <w:szCs w:val="20"/>
-              </w:rPr>
-              <w:t xml:space="preserve">  Romanian</w:t>
+              <w:t xml:space="preserve">Nationality:   Romanian</w:t>
             </w:r>
           </w:p>
           <w:p>
@@ -593,7 +561,7 @@
                 <w:sz w:val="19"/>
                 <w:szCs w:val="19"/>
               </w:rPr>
-              <w:t xml:space="preserve">Publishing the QuickOrg2 app on Google Play (currently in closed testing, awaiting approval).</w:t>
+              <w:t xml:space="preserve">Growing QuickOrg2 (now live on Google Play) and releasing it on iOS.</w:t>
             </w:r>
           </w:p>
           <w:p>
@@ -1181,7 +1149,7 @@
                 <w:sz w:val="20"/>
                 <w:szCs w:val="20"/>
               </w:rPr>
-              <w:t xml:space="preserve">Bachelor's Degree, Faculty of Economics and Business Administration</w:t>
+              <w:t xml:space="preserve">Bachelor of Economic Sciences (Licentiat), Business Administration · graduated 2026 · 180 ECTS · final exam 9.35/10 · Faculty of Economics and Business Administration</w:t>
             </w:r>
           </w:p>
           <w:p>
@@ -1247,7 +1215,7 @@
                 <w:sz w:val="20"/>
                 <w:szCs w:val="20"/>
               </w:rPr>
-              <w:t xml:space="preserve">In closed testing on Google Play, awaiting approval for publication.</w:t>
+              <w:t xml:space="preserve">Live on Google Play (iOS version planned).</w:t>
             </w:r>
           </w:p>
           <w:p>

</xml_diff>

<commit_message>
cv: add Credit Consultant role at Easy Asset Management IFN S.A. (Sep-Dec 2025)
Co-Authored-By: Claude Opus 4.8 <noreply@anthropic.com>
</commit_message>
<xml_diff>
--- a/Images/cv-en.docx
+++ b/Images/cv-en.docx
@@ -821,6 +821,46 @@
                 <w:szCs w:val="20"/>
               </w:rPr>
               <w:t xml:space="preserve">Arrise - Pragmatic Play</w:t>
+            </w:r>
+          </w:p>
+          <w:p>
+            <w:pPr>
+              <w:spacing w:after="10" w:before="100"/>
+            </w:pPr>
+            <w:r>
+              <w:rPr>
+                <w:color w:val="1A1A1A"/>
+                <w:sz w:val="20"/>
+                <w:szCs w:val="20"/>
+              </w:rPr>
+              <w:t xml:space="preserve">September 2025 - December 2025</w:t>
+            </w:r>
+          </w:p>
+          <w:p>
+            <w:pPr>
+              <w:spacing w:after="20"/>
+            </w:pPr>
+            <w:r>
+              <w:rPr>
+                <w:b/>
+                <w:bCs/>
+                <w:color w:val="1A1A1A"/>
+                <w:sz w:val="20"/>
+                <w:szCs w:val="20"/>
+              </w:rPr>
+              <w:t xml:space="preserve">Credit Consultant </w:t>
+            </w:r>
+            <w:r>
+              <w:rPr>
+                <w:b/>
+                <w:bCs/>
+                <w:i/>
+                <w:iCs/>
+                <w:color w:val="1A1A1A"/>
+                <w:sz w:val="20"/>
+                <w:szCs w:val="20"/>
+              </w:rPr>
+              <w:t xml:space="preserve">Easy Asset Management IFN S.A.</w:t>
             </w:r>
           </w:p>
           <w:p>

</xml_diff>

<commit_message>
cv: keep current roles (Croupier, Bolt) on top; Credit Consultant below
Co-Authored-By: Claude Opus 4.8 <noreply@anthropic.com>
</commit_message>
<xml_diff>
--- a/Images/cv-en.docx
+++ b/Images/cv-en.docx
@@ -833,7 +833,7 @@
                 <w:sz w:val="20"/>
                 <w:szCs w:val="20"/>
               </w:rPr>
-              <w:t xml:space="preserve">September 2025 - December 2025</w:t>
+              <w:t xml:space="preserve">September 2024 - Current</w:t>
             </w:r>
           </w:p>
           <w:p>
@@ -848,7 +848,7 @@
                 <w:sz w:val="20"/>
                 <w:szCs w:val="20"/>
               </w:rPr>
-              <w:t xml:space="preserve">Credit Consultant </w:t>
+              <w:t xml:space="preserve">Driver </w:t>
             </w:r>
             <w:r>
               <w:rPr>
@@ -860,7 +860,7 @@
                 <w:sz w:val="20"/>
                 <w:szCs w:val="20"/>
               </w:rPr>
-              <w:t xml:space="preserve">Easy Asset Management IFN S.A.</w:t>
+              <w:t xml:space="preserve">Uber - Bolt</w:t>
             </w:r>
           </w:p>
           <w:p>
@@ -873,7 +873,7 @@
                 <w:sz w:val="20"/>
                 <w:szCs w:val="20"/>
               </w:rPr>
-              <w:t xml:space="preserve">September 2024 - Current</w:t>
+              <w:t xml:space="preserve">September 2025 - December 2025</w:t>
             </w:r>
           </w:p>
           <w:p>
@@ -888,7 +888,7 @@
                 <w:sz w:val="20"/>
                 <w:szCs w:val="20"/>
               </w:rPr>
-              <w:t xml:space="preserve">Driver </w:t>
+              <w:t xml:space="preserve">Credit Consultant </w:t>
             </w:r>
             <w:r>
               <w:rPr>
@@ -900,7 +900,7 @@
                 <w:sz w:val="20"/>
                 <w:szCs w:val="20"/>
               </w:rPr>
-              <w:t xml:space="preserve">Uber - Bolt</w:t>
+              <w:t xml:space="preserve">Easy Asset Management IFN S.A.</w:t>
             </w:r>
           </w:p>
           <w:p>

</xml_diff>